<commit_message>
docs: MANUAL 2.0, guia de instalacion y acceso al dia; memoria regenerada
- MANUAL.md, docs/INSTALACION_PRIMERA_VEZ.md y docs/MANUAL_ACCESO.md reescritos segun el
  producto actual (ya no admin/admin, Ollama en el host, Node 18 ni qwen2.5-coder:7b).
- install.sh / install.ps1: el aviso de .env existente prometia opciones que no existian.
- README, SECURITY, THIRD_PARTY_NOTICES, CHANGELOG, REQUISITOS y auditoria actualizados.
- Pruebas 57 -> 62 (backend) + 56 (consola): TRAZABILIDAD.md, memoria (PDF y Word) y
  guion del video regenerados con las cifras nuevas.

Co-Authored-By: Claude Opus 5.5 <noreply@anthropic.com>
Claude-Session: https://claude.ai/code/session_01FzcpYsaLbb531WTysGdXYH
</commit_message>
<xml_diff>
--- a/docs/memoria/P3_GrupoProyectoValhalla_Memoria.docx
+++ b/docs/memoria/P3_GrupoProyectoValhalla_Memoria.docx
@@ -436,7 +436,7 @@
                 <w:color w:val="0F5A3B"/>
                 <w:sz w:val="32"/>
               </w:rPr>
-              <w:t>57/57</w:t>
+              <w:t>118/118</w:t>
               <w:br/>
             </w:r>
             <w:r>
@@ -444,7 +444,7 @@
                 <w:color w:val="5D6E66"/>
                 <w:sz w:val="17"/>
               </w:rPr>
-              <w:t>pruebas automáticas superadas</w:t>
+              <w:t>pruebas automáticas superadas (62 backend · 56 consola)</w:t>
             </w:r>
           </w:p>
         </w:tc>
@@ -547,7 +547,7 @@
       </w:r>
       <w:r>
         <w:rPr/>
-        <w:t>: suite de 57 pruebas etiquetadas por requisito que genera automáticamente la matriz de trazabilidad.</w:t>
+        <w:t>: 62 pruebas del backend etiquetadas por requisito que generan automáticamente la matriz de trazabilidad, 56 pruebas unitarias de la consola e integración continua en GitHub que en cada cambio ejecuta pruebas, comprobación de tipos y auditoría de dependencias.</w:t>
       </w:r>
     </w:p>
     <w:p>
@@ -1800,7 +1800,7 @@
         </w:tc>
         <w:tc>
           <w:tcPr>
-            <w:tcW w:type="dxa" w:w="4830"/>
+            <w:tcW w:type="dxa" w:w="4501"/>
             <w:shd w:val="clear" w:color="auto" w:fill="0F5A3B"/>
           </w:tcPr>
           <w:p>
@@ -1816,7 +1816,7 @@
         </w:tc>
         <w:tc>
           <w:tcPr>
-            <w:tcW w:type="dxa" w:w="4141"/>
+            <w:tcW w:type="dxa" w:w="4501"/>
             <w:shd w:val="clear" w:color="auto" w:fill="0F5A3B"/>
           </w:tcPr>
           <w:p>
@@ -1850,7 +1850,7 @@
         </w:tc>
         <w:tc>
           <w:tcPr>
-            <w:tcW w:type="dxa" w:w="4830"/>
+            <w:tcW w:type="dxa" w:w="4501"/>
           </w:tcPr>
           <w:p>
             <w:r>
@@ -1907,7 +1907,7 @@
         </w:tc>
         <w:tc>
           <w:tcPr>
-            <w:tcW w:type="dxa" w:w="4141"/>
+            <w:tcW w:type="dxa" w:w="4501"/>
           </w:tcPr>
           <w:p>
             <w:r>
@@ -1938,7 +1938,7 @@
         </w:tc>
         <w:tc>
           <w:tcPr>
-            <w:tcW w:type="dxa" w:w="4830"/>
+            <w:tcW w:type="dxa" w:w="4501"/>
           </w:tcPr>
           <w:p>
             <w:r>
@@ -1980,7 +1980,7 @@
         </w:tc>
         <w:tc>
           <w:tcPr>
-            <w:tcW w:type="dxa" w:w="4141"/>
+            <w:tcW w:type="dxa" w:w="4501"/>
           </w:tcPr>
           <w:p>
             <w:r>
@@ -2011,7 +2011,7 @@
         </w:tc>
         <w:tc>
           <w:tcPr>
-            <w:tcW w:type="dxa" w:w="4830"/>
+            <w:tcW w:type="dxa" w:w="4501"/>
           </w:tcPr>
           <w:p>
             <w:r>
@@ -2038,7 +2038,7 @@
         </w:tc>
         <w:tc>
           <w:tcPr>
-            <w:tcW w:type="dxa" w:w="4141"/>
+            <w:tcW w:type="dxa" w:w="4501"/>
           </w:tcPr>
           <w:p>
             <w:r>
@@ -2069,7 +2069,7 @@
         </w:tc>
         <w:tc>
           <w:tcPr>
-            <w:tcW w:type="dxa" w:w="4830"/>
+            <w:tcW w:type="dxa" w:w="4501"/>
           </w:tcPr>
           <w:p>
             <w:r>
@@ -2096,7 +2096,7 @@
         </w:tc>
         <w:tc>
           <w:tcPr>
-            <w:tcW w:type="dxa" w:w="4141"/>
+            <w:tcW w:type="dxa" w:w="4501"/>
           </w:tcPr>
           <w:p>
             <w:r>
@@ -2127,7 +2127,7 @@
         </w:tc>
         <w:tc>
           <w:tcPr>
-            <w:tcW w:type="dxa" w:w="4830"/>
+            <w:tcW w:type="dxa" w:w="4501"/>
           </w:tcPr>
           <w:p>
             <w:r>
@@ -2154,7 +2154,7 @@
         </w:tc>
         <w:tc>
           <w:tcPr>
-            <w:tcW w:type="dxa" w:w="4141"/>
+            <w:tcW w:type="dxa" w:w="4501"/>
           </w:tcPr>
           <w:p>
             <w:r>
@@ -2185,7 +2185,7 @@
         </w:tc>
         <w:tc>
           <w:tcPr>
-            <w:tcW w:type="dxa" w:w="4830"/>
+            <w:tcW w:type="dxa" w:w="4501"/>
           </w:tcPr>
           <w:p>
             <w:r>
@@ -2212,7 +2212,7 @@
         </w:tc>
         <w:tc>
           <w:tcPr>
-            <w:tcW w:type="dxa" w:w="4141"/>
+            <w:tcW w:type="dxa" w:w="4501"/>
           </w:tcPr>
           <w:p>
             <w:r>
@@ -2243,7 +2243,7 @@
         </w:tc>
         <w:tc>
           <w:tcPr>
-            <w:tcW w:type="dxa" w:w="4830"/>
+            <w:tcW w:type="dxa" w:w="4501"/>
           </w:tcPr>
           <w:p>
             <w:r>
@@ -2293,14 +2293,14 @@
         </w:tc>
         <w:tc>
           <w:tcPr>
-            <w:tcW w:type="dxa" w:w="4141"/>
-          </w:tcPr>
-          <w:p>
-            <w:r>
-              <w:rPr>
-                <w:sz w:val="17"/>
-              </w:rPr>
-              <w:t>Manual: instalación desde cero el 01/10/2026 desde el repositorio público, correcta (memoria, §9.2)</w:t>
+            <w:tcW w:type="dxa" w:w="4501"/>
+          </w:tcPr>
+          <w:p>
+            <w:r>
+              <w:rPr>
+                <w:sz w:val="17"/>
+              </w:rPr>
+              <w:t>Automática (arranque: esquema, administrador y datos semilla sin duplicar) + Manual: instalación desde cero el 01/10/2026 desde el repositorio público, correcta (memoria, §9.2)</w:t>
             </w:r>
           </w:p>
         </w:tc>
@@ -2324,7 +2324,7 @@
         </w:tc>
         <w:tc>
           <w:tcPr>
-            <w:tcW w:type="dxa" w:w="4830"/>
+            <w:tcW w:type="dxa" w:w="4501"/>
           </w:tcPr>
           <w:p>
             <w:r>
@@ -2351,7 +2351,7 @@
         </w:tc>
         <w:tc>
           <w:tcPr>
-            <w:tcW w:type="dxa" w:w="4141"/>
+            <w:tcW w:type="dxa" w:w="4501"/>
           </w:tcPr>
           <w:p>
             <w:r>
@@ -2389,7 +2389,7 @@
         </w:tc>
         <w:tc>
           <w:tcPr>
-            <w:tcW w:type="dxa" w:w="4830"/>
+            <w:tcW w:type="dxa" w:w="4501"/>
           </w:tcPr>
           <w:p>
             <w:r>
@@ -2416,7 +2416,7 @@
         </w:tc>
         <w:tc>
           <w:tcPr>
-            <w:tcW w:type="dxa" w:w="4141"/>
+            <w:tcW w:type="dxa" w:w="4501"/>
           </w:tcPr>
           <w:p>
             <w:r>
@@ -2471,7 +2471,7 @@
       <w:r>
         <w:drawing>
           <wp:inline xmlns:a="http://schemas.openxmlformats.org/drawingml/2006/main" xmlns:pic="http://schemas.openxmlformats.org/drawingml/2006/picture">
-            <wp:extent cx="5940000" cy="1441867"/>
+            <wp:extent cx="5940000" cy="1417220"/>
             <wp:docPr id="1" name="Picture 1"/>
             <wp:cNvGraphicFramePr>
               <a:graphicFrameLocks noChangeAspect="1"/>
@@ -2492,7 +2492,7 @@
                   <pic:spPr>
                     <a:xfrm>
                       <a:off x="0" y="0"/>
-                      <a:ext cx="5940000" cy="1441867"/>
+                      <a:ext cx="5940000" cy="1417220"/>
                     </a:xfrm>
                     <a:prstGeom prst="rect"/>
                   </pic:spPr>
@@ -4947,7 +4947,7 @@
         </w:trPr>
         <w:tc>
           <w:tcPr>
-            <w:tcW w:type="dxa" w:w="4800"/>
+            <w:tcW w:type="dxa" w:w="4501"/>
             <w:shd w:val="clear" w:color="auto" w:fill="0F5A3B"/>
           </w:tcPr>
           <w:p>
@@ -4979,7 +4979,7 @@
         </w:tc>
         <w:tc>
           <w:tcPr>
-            <w:tcW w:type="dxa" w:w="4165"/>
+            <w:tcW w:type="dxa" w:w="4501"/>
             <w:shd w:val="clear" w:color="auto" w:fill="0F5A3B"/>
           </w:tcPr>
           <w:p>
@@ -5000,7 +5000,7 @@
         </w:trPr>
         <w:tc>
           <w:tcPr>
-            <w:tcW w:type="dxa" w:w="4800"/>
+            <w:tcW w:type="dxa" w:w="4501"/>
           </w:tcPr>
           <w:p>
             <w:r>
@@ -5039,7 +5039,7 @@
         </w:tc>
         <w:tc>
           <w:tcPr>
-            <w:tcW w:type="dxa" w:w="4165"/>
+            <w:tcW w:type="dxa" w:w="4501"/>
           </w:tcPr>
           <w:p>
             <w:r>
@@ -5057,7 +5057,7 @@
         </w:trPr>
         <w:tc>
           <w:tcPr>
-            <w:tcW w:type="dxa" w:w="4800"/>
+            <w:tcW w:type="dxa" w:w="4501"/>
           </w:tcPr>
           <w:p>
             <w:r>
@@ -5109,7 +5109,7 @@
         </w:tc>
         <w:tc>
           <w:tcPr>
-            <w:tcW w:type="dxa" w:w="4165"/>
+            <w:tcW w:type="dxa" w:w="4501"/>
           </w:tcPr>
           <w:p>
             <w:r>
@@ -5140,7 +5140,7 @@
         </w:trPr>
         <w:tc>
           <w:tcPr>
-            <w:tcW w:type="dxa" w:w="4800"/>
+            <w:tcW w:type="dxa" w:w="4501"/>
           </w:tcPr>
           <w:p>
             <w:r>
@@ -5166,7 +5166,7 @@
         </w:tc>
         <w:tc>
           <w:tcPr>
-            <w:tcW w:type="dxa" w:w="4165"/>
+            <w:tcW w:type="dxa" w:w="4501"/>
           </w:tcPr>
           <w:p>
             <w:r>
@@ -5197,7 +5197,7 @@
         </w:trPr>
         <w:tc>
           <w:tcPr>
-            <w:tcW w:type="dxa" w:w="4800"/>
+            <w:tcW w:type="dxa" w:w="4501"/>
           </w:tcPr>
           <w:p>
             <w:r>
@@ -5223,7 +5223,7 @@
         </w:tc>
         <w:tc>
           <w:tcPr>
-            <w:tcW w:type="dxa" w:w="4165"/>
+            <w:tcW w:type="dxa" w:w="4501"/>
           </w:tcPr>
           <w:p>
             <w:r>
@@ -5248,7 +5248,7 @@
         </w:trPr>
         <w:tc>
           <w:tcPr>
-            <w:tcW w:type="dxa" w:w="4800"/>
+            <w:tcW w:type="dxa" w:w="4501"/>
           </w:tcPr>
           <w:p>
             <w:r>
@@ -5274,7 +5274,7 @@
         </w:tc>
         <w:tc>
           <w:tcPr>
-            <w:tcW w:type="dxa" w:w="4165"/>
+            <w:tcW w:type="dxa" w:w="4501"/>
           </w:tcPr>
           <w:p>
             <w:r>
@@ -5305,7 +5305,7 @@
         </w:trPr>
         <w:tc>
           <w:tcPr>
-            <w:tcW w:type="dxa" w:w="4800"/>
+            <w:tcW w:type="dxa" w:w="4501"/>
           </w:tcPr>
           <w:p>
             <w:r>
@@ -5338,7 +5338,7 @@
         </w:tc>
         <w:tc>
           <w:tcPr>
-            <w:tcW w:type="dxa" w:w="4165"/>
+            <w:tcW w:type="dxa" w:w="4501"/>
           </w:tcPr>
           <w:p>
             <w:r>
@@ -5356,7 +5356,7 @@
         </w:trPr>
         <w:tc>
           <w:tcPr>
-            <w:tcW w:type="dxa" w:w="4800"/>
+            <w:tcW w:type="dxa" w:w="4501"/>
           </w:tcPr>
           <w:p>
             <w:r>
@@ -5382,7 +5382,7 @@
         </w:tc>
         <w:tc>
           <w:tcPr>
-            <w:tcW w:type="dxa" w:w="4165"/>
+            <w:tcW w:type="dxa" w:w="4501"/>
           </w:tcPr>
           <w:p>
             <w:r>
@@ -5400,7 +5400,7 @@
         </w:trPr>
         <w:tc>
           <w:tcPr>
-            <w:tcW w:type="dxa" w:w="4800"/>
+            <w:tcW w:type="dxa" w:w="4501"/>
           </w:tcPr>
           <w:p>
             <w:r>
@@ -5426,7 +5426,7 @@
         </w:tc>
         <w:tc>
           <w:tcPr>
-            <w:tcW w:type="dxa" w:w="4165"/>
+            <w:tcW w:type="dxa" w:w="4501"/>
           </w:tcPr>
           <w:p>
             <w:r>
@@ -5447,6 +5447,190 @@
                 <w:sz w:val="17"/>
               </w:rPr>
               <w:t>) y cortafuegos persistente para el resto</w:t>
+            </w:r>
+          </w:p>
+        </w:tc>
+      </w:tr>
+      <w:tr>
+        <w:trPr>
+          <w:cantSplit/>
+        </w:trPr>
+        <w:tc>
+          <w:tcPr>
+            <w:tcW w:type="dxa" w:w="4501"/>
+          </w:tcPr>
+          <w:p>
+            <w:r>
+              <w:rPr>
+                <w:sz w:val="17"/>
+              </w:rPr>
+              <w:t xml:space="preserve">Durante los 5 minutos siguientes a encender la máquina, la lista de proxies de confianza quedaba vacía: IP real y cookies </w:t>
+            </w:r>
+            <w:r>
+              <w:rPr>
+                <w:rFonts w:ascii="Consolas" w:hAnsi="Consolas"/>
+                <w:sz w:val="17"/>
+              </w:rPr>
+              <w:t>Secure</w:t>
+            </w:r>
+            <w:r>
+              <w:rPr>
+                <w:sz w:val="17"/>
+              </w:rPr>
+              <w:t xml:space="preserve"> incorrectas</w:t>
+            </w:r>
+          </w:p>
+        </w:tc>
+        <w:tc>
+          <w:tcPr>
+            <w:tcW w:type="dxa" w:w="1020"/>
+          </w:tcPr>
+          <w:p>
+            <w:r>
+              <w:rPr>
+                <w:sz w:val="17"/>
+              </w:rPr>
+              <w:t>Medio</w:t>
+            </w:r>
+          </w:p>
+        </w:tc>
+        <w:tc>
+          <w:tcPr>
+            <w:tcW w:type="dxa" w:w="4501"/>
+          </w:tcPr>
+          <w:p>
+            <w:r>
+              <w:rPr>
+                <w:sz w:val="17"/>
+              </w:rPr>
+              <w:t>Caché inicializada correctamente; prueba que simula una máquina recién arrancada</w:t>
+            </w:r>
+          </w:p>
+        </w:tc>
+      </w:tr>
+      <w:tr>
+        <w:trPr>
+          <w:cantSplit/>
+        </w:trPr>
+        <w:tc>
+          <w:tcPr>
+            <w:tcW w:type="dxa" w:w="4501"/>
+          </w:tcPr>
+          <w:p>
+            <w:r>
+              <w:rPr>
+                <w:sz w:val="17"/>
+              </w:rPr>
+              <w:t>La consola cargaba sus fuentes de Google Fonts: Google recibía la IP y el navegador de cada analista en cada acceso</w:t>
+            </w:r>
+          </w:p>
+        </w:tc>
+        <w:tc>
+          <w:tcPr>
+            <w:tcW w:type="dxa" w:w="1020"/>
+          </w:tcPr>
+          <w:p>
+            <w:r>
+              <w:rPr>
+                <w:sz w:val="17"/>
+              </w:rPr>
+              <w:t>Bajo</w:t>
+            </w:r>
+          </w:p>
+        </w:tc>
+        <w:tc>
+          <w:tcPr>
+            <w:tcW w:type="dxa" w:w="4501"/>
+          </w:tcPr>
+          <w:p>
+            <w:r>
+              <w:rPr>
+                <w:sz w:val="17"/>
+              </w:rPr>
+              <w:t xml:space="preserve">Fuentes autoalojadas (paquetes </w:t>
+            </w:r>
+            <w:r>
+              <w:rPr>
+                <w:rFonts w:ascii="Consolas" w:hAnsi="Consolas"/>
+                <w:sz w:val="17"/>
+              </w:rPr>
+              <w:t>@fontsource</w:t>
+            </w:r>
+            <w:r>
+              <w:rPr>
+                <w:sz w:val="17"/>
+              </w:rPr>
+              <w:t>, licencia OFL) y CSP sin dominios de terceros; una prueba impide volver a introducirlas</w:t>
+            </w:r>
+          </w:p>
+        </w:tc>
+      </w:tr>
+      <w:tr>
+        <w:trPr>
+          <w:cantSplit/>
+        </w:trPr>
+        <w:tc>
+          <w:tcPr>
+            <w:tcW w:type="dxa" w:w="4501"/>
+          </w:tcPr>
+          <w:p>
+            <w:r>
+              <w:rPr>
+                <w:sz w:val="17"/>
+              </w:rPr>
+              <w:t xml:space="preserve">El saneado del chat mutilaba mensajes con </w:t>
+            </w:r>
+            <w:r>
+              <w:rPr>
+                <w:rFonts w:ascii="Consolas" w:hAnsi="Consolas"/>
+                <w:sz w:val="17"/>
+              </w:rPr>
+              <w:t>&lt;</w:t>
+            </w:r>
+            <w:r>
+              <w:rPr>
+                <w:sz w:val="17"/>
+              </w:rPr>
+              <w:t xml:space="preserve"> o </w:t>
+            </w:r>
+            <w:r>
+              <w:rPr>
+                <w:rFonts w:ascii="Consolas" w:hAnsi="Consolas"/>
+                <w:sz w:val="17"/>
+              </w:rPr>
+              <w:t>&gt;</w:t>
+            </w:r>
+            <w:r>
+              <w:rPr>
+                <w:sz w:val="17"/>
+              </w:rPr>
+              <w:t xml:space="preserve"> (comandos, payloads) sin aportar protección, porque React ya escapa el texto</w:t>
+            </w:r>
+          </w:p>
+        </w:tc>
+        <w:tc>
+          <w:tcPr>
+            <w:tcW w:type="dxa" w:w="1020"/>
+          </w:tcPr>
+          <w:p>
+            <w:r>
+              <w:rPr>
+                <w:sz w:val="17"/>
+              </w:rPr>
+              <w:t>Bajo</w:t>
+            </w:r>
+          </w:p>
+        </w:tc>
+        <w:tc>
+          <w:tcPr>
+            <w:tcW w:type="dxa" w:w="4501"/>
+          </w:tcPr>
+          <w:p>
+            <w:r>
+              <w:rPr>
+                <w:sz w:val="17"/>
+              </w:rPr>
+              <w:t>Se conserva el texto y se eliminan los caracteres invisibles de reordenación (suplantación tipo «Trojan Source»); DOMPurify queda para el HTML</w:t>
             </w:r>
           </w:p>
         </w:tc>
@@ -5846,6 +6030,45 @@
     <w:p>
       <w:r>
         <w:rPr/>
+        <w:t>La auditoría no es una foto fija: la integración continua (</w:t>
+      </w:r>
+      <w:r>
+        <w:rPr>
+          <w:rFonts w:ascii="Consolas" w:hAnsi="Consolas"/>
+          <w:sz w:val="17"/>
+        </w:rPr>
+        <w:t>.github/workflows/ci.yml</w:t>
+      </w:r>
+      <w:r>
+        <w:rPr/>
+        <w:t xml:space="preserve">) repite </w:t>
+      </w:r>
+      <w:r>
+        <w:rPr>
+          <w:rFonts w:ascii="Consolas" w:hAnsi="Consolas"/>
+          <w:sz w:val="17"/>
+        </w:rPr>
+        <w:t>pip-audit</w:t>
+      </w:r>
+      <w:r>
+        <w:rPr/>
+        <w:t xml:space="preserve"> y </w:t>
+      </w:r>
+      <w:r>
+        <w:rPr>
+          <w:rFonts w:ascii="Consolas" w:hAnsi="Consolas"/>
+          <w:sz w:val="17"/>
+        </w:rPr>
+        <w:t>npm audit</w:t>
+      </w:r>
+      <w:r>
+        <w:rPr/>
+        <w:t xml:space="preserve"> en cada cambio y cada lunes. Así se detectaron CVE publicadas después de la revisión en PyJWT 2.13.0 y urllib3 2.7.0, que se actualizaron a 2.15.1 y 2.8.0.</w:t>
+      </w:r>
+    </w:p>
+    <w:p>
+      <w:r>
+        <w:rPr/>
         <w:t>Además se revisaron las licencias de todas las dependencias (</w:t>
       </w:r>
       <w:r>
@@ -5898,13 +6121,13 @@
     <w:p>
       <w:r>
         <w:rPr/>
-        <w:t xml:space="preserve">Al empezar la práctica había 17 pruebas, y 11 de ellas ni siquiera arrancaban: el modelo usaba un tipo de columna de PostgreSQL que la base de datos de pruebas no entendía. La suite actual tiene </w:t>
+        <w:t xml:space="preserve">Al empezar la práctica había 17 pruebas, y 11 de ellas ni siquiera arrancaban: el modelo usaba un tipo de columna de PostgreSQL que la base de datos de pruebas no entendía. La suite actual del backend tiene </w:t>
       </w:r>
       <w:r>
         <w:rPr>
           <w:b/>
         </w:rPr>
-        <w:t>57 pruebas</w:t>
+        <w:t>62 pruebas</w:t>
       </w:r>
       <w:r>
         <w:rPr/>
@@ -5942,7 +6165,7 @@
         </w:trPr>
         <w:tc>
           <w:tcPr>
-            <w:tcW w:type="dxa" w:w="2475"/>
+            <w:tcW w:type="dxa" w:w="2419"/>
             <w:shd w:val="clear" w:color="auto" w:fill="0F5A3B"/>
           </w:tcPr>
           <w:p>
@@ -5974,7 +6197,7 @@
         </w:tc>
         <w:tc>
           <w:tcPr>
-            <w:tcW w:type="dxa" w:w="6268"/>
+            <w:tcW w:type="dxa" w:w="6339"/>
             <w:shd w:val="clear" w:color="auto" w:fill="0F5A3B"/>
           </w:tcPr>
           <w:p>
@@ -5995,7 +6218,7 @@
         </w:trPr>
         <w:tc>
           <w:tcPr>
-            <w:tcW w:type="dxa" w:w="2475"/>
+            <w:tcW w:type="dxa" w:w="2419"/>
           </w:tcPr>
           <w:p>
             <w:r>
@@ -6021,7 +6244,7 @@
         </w:tc>
         <w:tc>
           <w:tcPr>
-            <w:tcW w:type="dxa" w:w="6268"/>
+            <w:tcW w:type="dxa" w:w="6339"/>
           </w:tcPr>
           <w:p>
             <w:r>
@@ -6052,7 +6275,7 @@
         </w:trPr>
         <w:tc>
           <w:tcPr>
-            <w:tcW w:type="dxa" w:w="2475"/>
+            <w:tcW w:type="dxa" w:w="2419"/>
           </w:tcPr>
           <w:p>
             <w:r>
@@ -6078,7 +6301,7 @@
         </w:tc>
         <w:tc>
           <w:tcPr>
-            <w:tcW w:type="dxa" w:w="6268"/>
+            <w:tcW w:type="dxa" w:w="6339"/>
           </w:tcPr>
           <w:p>
             <w:r>
@@ -6096,7 +6319,7 @@
         </w:trPr>
         <w:tc>
           <w:tcPr>
-            <w:tcW w:type="dxa" w:w="2475"/>
+            <w:tcW w:type="dxa" w:w="2419"/>
           </w:tcPr>
           <w:p>
             <w:r>
@@ -6122,7 +6345,7 @@
         </w:tc>
         <w:tc>
           <w:tcPr>
-            <w:tcW w:type="dxa" w:w="6268"/>
+            <w:tcW w:type="dxa" w:w="6339"/>
           </w:tcPr>
           <w:p>
             <w:r>
@@ -6140,7 +6363,7 @@
         </w:trPr>
         <w:tc>
           <w:tcPr>
-            <w:tcW w:type="dxa" w:w="2475"/>
+            <w:tcW w:type="dxa" w:w="2419"/>
           </w:tcPr>
           <w:p>
             <w:r>
@@ -6166,7 +6389,7 @@
         </w:tc>
         <w:tc>
           <w:tcPr>
-            <w:tcW w:type="dxa" w:w="6268"/>
+            <w:tcW w:type="dxa" w:w="6339"/>
           </w:tcPr>
           <w:p>
             <w:r>
@@ -6184,7 +6407,7 @@
         </w:trPr>
         <w:tc>
           <w:tcPr>
-            <w:tcW w:type="dxa" w:w="2475"/>
+            <w:tcW w:type="dxa" w:w="2419"/>
           </w:tcPr>
           <w:p>
             <w:r>
@@ -6210,7 +6433,7 @@
         </w:tc>
         <w:tc>
           <w:tcPr>
-            <w:tcW w:type="dxa" w:w="6268"/>
+            <w:tcW w:type="dxa" w:w="6339"/>
           </w:tcPr>
           <w:p>
             <w:r>
@@ -6218,6 +6441,50 @@
                 <w:sz w:val="17"/>
               </w:rPr>
               <w:t>Huella que detecta manipulación, fórmula de prioridad de CVE, bloqueo solo si Wazuh confirma, auditoría sin cuerpos</w:t>
+            </w:r>
+          </w:p>
+        </w:tc>
+      </w:tr>
+      <w:tr>
+        <w:trPr>
+          <w:cantSplit/>
+        </w:trPr>
+        <w:tc>
+          <w:tcPr>
+            <w:tcW w:type="dxa" w:w="2419"/>
+          </w:tcPr>
+          <w:p>
+            <w:r>
+              <w:rPr>
+                <w:sz w:val="17"/>
+              </w:rPr>
+              <w:t>Arranque y apagado del servicio</w:t>
+            </w:r>
+          </w:p>
+        </w:tc>
+        <w:tc>
+          <w:tcPr>
+            <w:tcW w:type="dxa" w:w="1020"/>
+          </w:tcPr>
+          <w:p>
+            <w:r>
+              <w:rPr>
+                <w:sz w:val="17"/>
+              </w:rPr>
+              <w:t>5</w:t>
+            </w:r>
+          </w:p>
+        </w:tc>
+        <w:tc>
+          <w:tcPr>
+            <w:tcW w:type="dxa" w:w="6339"/>
+          </w:tcPr>
+          <w:p>
+            <w:r>
+              <w:rPr>
+                <w:sz w:val="17"/>
+              </w:rPr>
+              <w:t>Esquema, administrador y datos semilla sin duplicar; producción no arranca sin administrador; el apagado no pierde auditorías en curso</w:t>
             </w:r>
           </w:p>
         </w:tc>
@@ -6227,7 +6494,53 @@
     <w:p>
       <w:r>
         <w:rPr/>
-        <w:t>Las pruebas también encontraron fallos reales: comparaciones de fechas sin zona horaria en invitaciones y métricas, que se corrigieron en el código.</w:t>
+        <w:t xml:space="preserve">La consola tiene su propia suite de </w:t>
+      </w:r>
+      <w:r>
+        <w:rPr>
+          <w:b/>
+        </w:rPr>
+        <w:t>56 pruebas unitarias</w:t>
+      </w:r>
+      <w:r>
+        <w:rPr/>
+        <w:t xml:space="preserve"> (Vitest y Testing Library): saneado frente a XSS, cliente de la API (token CSRF, una sola renovación de sesión aunque caduquen varias peticiones a la vez), estado global, el botón de «mantener pulsado» de las acciones destructivas y la ausencia de recursos de terceros.</w:t>
+      </w:r>
+    </w:p>
+    <w:p>
+      <w:pPr>
+        <w:shd w:val="clear" w:color="auto" w:fill="EEF6F1"/>
+      </w:pPr>
+      <w:r>
+        <w:rPr>
+          <w:rFonts w:ascii="Consolas" w:hAnsi="Consolas"/>
+          <w:sz w:val="17"/>
+        </w:rPr>
+        <w:t>cd frontend &amp;&amp; npm test        # pruebas de la consola</w:t>
+        <w:br/>
+        <w:t>cd frontend &amp;&amp; npm run typecheck   # comprobación de tipos (0 errores)</w:t>
+      </w:r>
+    </w:p>
+    <w:p>
+      <w:r>
+        <w:rPr/>
+        <w:t xml:space="preserve">Las dos suites, la comprobación de tipos, el build de producción, la auditoría de dependencias y la construcción de las imágenes Docker se ejecutan en </w:t>
+      </w:r>
+      <w:r>
+        <w:rPr>
+          <w:b/>
+        </w:rPr>
+        <w:t>GitHub Actions</w:t>
+      </w:r>
+      <w:r>
+        <w:rPr/>
+        <w:t xml:space="preserve"> en cada cambio; la matriz de trazabilidad de cada ejecución queda en el resumen del job.</w:t>
+      </w:r>
+    </w:p>
+    <w:p>
+      <w:r>
+        <w:rPr/>
+        <w:t>Las pruebas también encontraron fallos reales que se corrigieron en el código: comparaciones de fechas sin zona horaria en invitaciones y métricas, la lista de proxies de confianza vacía tras encender la máquina, traducciones de alertas que fallaban con paréntesis y el chat que borraba texto legítimo.</w:t>
       </w:r>
     </w:p>
     <w:p>
@@ -6247,7 +6560,7 @@
         <w:rPr>
           <w:b/>
         </w:rPr>
-        <w:t>57 de 57 pruebas superadas.</w:t>
+        <w:t>62 de 62 pruebas superadas.</w:t>
       </w:r>
     </w:p>
     <w:tbl>
@@ -7586,7 +7899,7 @@
               <w:rPr>
                 <w:sz w:val="17"/>
               </w:rPr>
-              <w:t>2</w:t>
+              <w:t>3</w:t>
             </w:r>
           </w:p>
         </w:tc>
@@ -7599,7 +7912,7 @@
               <w:rPr>
                 <w:sz w:val="17"/>
               </w:rPr>
-              <w:t>✅ 2/2</w:t>
+              <w:t>✅ 3/3</w:t>
             </w:r>
           </w:p>
         </w:tc>
@@ -7726,7 +8039,7 @@
               <w:rPr>
                 <w:sz w:val="17"/>
               </w:rPr>
-              <w:t>1</w:t>
+              <w:t>3</w:t>
             </w:r>
           </w:p>
         </w:tc>
@@ -7739,7 +8052,7 @@
               <w:rPr>
                 <w:sz w:val="17"/>
               </w:rPr>
-              <w:t>✅ 1/1</w:t>
+              <w:t>✅ 3/3</w:t>
             </w:r>
           </w:p>
         </w:tc>
@@ -7936,7 +8249,7 @@
               <w:rPr>
                 <w:sz w:val="17"/>
               </w:rPr>
-              <w:t>—</w:t>
+              <w:t>2</w:t>
             </w:r>
           </w:p>
         </w:tc>
@@ -7949,7 +8262,7 @@
               <w:rPr>
                 <w:sz w:val="17"/>
               </w:rPr>
-              <w:t>—</w:t>
+              <w:t>✅ 2/2</w:t>
             </w:r>
           </w:p>
         </w:tc>

</xml_diff>